<commit_message>
updating tables and figures
</commit_message>
<xml_diff>
--- a/tables_figs/desctable.docx
+++ b/tables_figs/desctable.docx
@@ -120,6 +120,15 @@
                 <w:sz w:val="20"/>
                 <w:szCs w:val="20"/>
               </w:rPr>
+              <w:t xml:space="preserve">Analytic </w:t>
+            </w:r>
+            <w:r>
+              <w:rPr>
+                <w:rFonts w:ascii="Times New Roman" w:eastAsia="Helvetica" w:hAnsi="Times New Roman" w:cs="Times New Roman"/>
+                <w:color w:val="000000"/>
+                <w:sz w:val="20"/>
+                <w:szCs w:val="20"/>
+              </w:rPr>
               <w:t>Sample</w:t>
             </w:r>
           </w:p>
@@ -167,7 +176,7 @@
                 <w:sz w:val="20"/>
                 <w:szCs w:val="20"/>
               </w:rPr>
-              <w:t>Full United States</w:t>
+              <w:t>All State-Years</w:t>
             </w:r>
           </w:p>
         </w:tc>

</xml_diff>